<commit_message>
nmv 16 08 2026
</commit_message>
<xml_diff>
--- a/TS-Kramam/TS-3.4/TS 3.4 Malayalam Krama Paatam Corrections.docx
+++ b/TS-Kramam/TS-3.4/TS 3.4 Malayalam Krama Paatam Corrections.docx
@@ -1,6 +1,6 @@
 
 <file path=word/document.xml><?xml version="1.0" encoding="utf-8"?>
-<w:document xmlns:wpc="http://schemas.microsoft.com/office/word/2010/wordprocessingCanvas" xmlns:cx="http://schemas.microsoft.com/office/drawing/2014/chartex" xmlns:cx1="http://schemas.microsoft.com/office/drawing/2015/9/8/chartex" xmlns:cx2="http://schemas.microsoft.com/office/drawing/2015/10/21/chartex" xmlns:cx3="http://schemas.microsoft.com/office/drawing/2016/5/9/chartex" xmlns:cx4="http://schemas.microsoft.com/office/drawing/2016/5/10/chartex" xmlns:cx5="http://schemas.microsoft.com/office/drawing/2016/5/11/chartex" xmlns:cx6="http://schemas.microsoft.com/office/drawing/2016/5/12/chartex" xmlns:cx7="http://schemas.microsoft.com/office/drawing/2016/5/13/chartex" xmlns:cx8="http://schemas.microsoft.com/office/drawing/2016/5/14/chartex" xmlns:mc="http://schemas.openxmlformats.org/markup-compatibility/2006" xmlns:aink="http://schemas.microsoft.com/office/drawing/2016/ink" xmlns:am3d="http://schemas.microsoft.com/office/drawing/2017/model3d" xmlns:o="urn:schemas-microsoft-com:office:office" xmlns:oel="http://schemas.microsoft.com/office/2019/extlst" xmlns:r="http://schemas.openxmlformats.org/officeDocument/2006/relationships" xmlns:m="http://schemas.openxmlformats.org/officeDocument/2006/math" xmlns:v="urn:schemas-microsoft-com:vml" xmlns:wp14="http://schemas.microsoft.com/office/word/2010/wordprocessingDrawing" xmlns:wp="http://schemas.openxmlformats.org/drawingml/2006/wordprocessingDrawing" xmlns:w10="urn:schemas-microsoft-com:office:word" xmlns:w="http://schemas.openxmlformats.org/wordprocessingml/2006/main" xmlns:w14="http://schemas.microsoft.com/office/word/2010/wordml" xmlns:w15="http://schemas.microsoft.com/office/word/2012/wordml" xmlns:w16cex="http://schemas.microsoft.com/office/word/2018/wordml/cex" xmlns:w16cid="http://schemas.microsoft.com/office/word/2016/wordml/cid" xmlns:w16="http://schemas.microsoft.com/office/word/2018/wordml" xmlns:w16du="http://schemas.microsoft.com/office/word/2023/wordml/word16du" xmlns:w16sdtdh="http://schemas.microsoft.com/office/word/2020/wordml/sdtdatahash" xmlns:w16sdtfl="http://schemas.microsoft.com/office/word/2024/wordml/sdtformatlock" xmlns:w16se="http://schemas.microsoft.com/office/word/2015/wordml/symex" xmlns:wpg="http://schemas.microsoft.com/office/word/2010/wordprocessingGroup" xmlns:wpi="http://schemas.microsoft.com/office/word/2010/wordprocessingInk" xmlns:wne="http://schemas.microsoft.com/office/word/2006/wordml" xmlns:wps="http://schemas.microsoft.com/office/word/2010/wordprocessingShape" mc:Ignorable="w14 w15 w16se w16cid w16 w16cex w16sdtdh w16sdtfl w16du wp14">
+<w:document xmlns:wpc="http://schemas.microsoft.com/office/word/2010/wordprocessingCanvas" xmlns:cx="http://schemas.microsoft.com/office/drawing/2014/chartex" xmlns:cx1="http://schemas.microsoft.com/office/drawing/2015/9/8/chartex" xmlns:cx2="http://schemas.microsoft.com/office/drawing/2015/10/21/chartex" xmlns:cx3="http://schemas.microsoft.com/office/drawing/2016/5/9/chartex" xmlns:cx4="http://schemas.microsoft.com/office/drawing/2016/5/10/chartex" xmlns:cx5="http://schemas.microsoft.com/office/drawing/2016/5/11/chartex" xmlns:cx6="http://schemas.microsoft.com/office/drawing/2016/5/12/chartex" xmlns:cx7="http://schemas.microsoft.com/office/drawing/2016/5/13/chartex" xmlns:cx8="http://schemas.microsoft.com/office/drawing/2016/5/14/chartex" xmlns:mc="http://schemas.openxmlformats.org/markup-compatibility/2006" xmlns:aink="http://schemas.microsoft.com/office/drawing/2016/ink" xmlns:am3d="http://schemas.microsoft.com/office/drawing/2017/model3d" xmlns:o="urn:schemas-microsoft-com:office:office" xmlns:oel="http://schemas.microsoft.com/office/2019/extlst" xmlns:r="http://schemas.openxmlformats.org/officeDocument/2006/relationships" xmlns:m="http://schemas.openxmlformats.org/officeDocument/2006/math" xmlns:v="urn:schemas-microsoft-com:vml" xmlns:wp14="http://schemas.microsoft.com/office/word/2010/wordprocessingDrawing" xmlns:wp="http://schemas.openxmlformats.org/drawingml/2006/wordprocessingDrawing" xmlns:w10="urn:schemas-microsoft-com:office:word" xmlns:w="http://schemas.openxmlformats.org/wordprocessingml/2006/main" xmlns:w14="http://schemas.microsoft.com/office/word/2010/wordml" xmlns:w15="http://schemas.microsoft.com/office/word/2012/wordml" xmlns:w16cei="http://schemas.microsoft.com/office/word/2026/wordml/cei" xmlns:w16cex="http://schemas.microsoft.com/office/word/2018/wordml/cex" xmlns:w16cid="http://schemas.microsoft.com/office/word/2016/wordml/cid" xmlns:w16="http://schemas.microsoft.com/office/word/2018/wordml" xmlns:w16du="http://schemas.microsoft.com/office/word/2023/wordml/word16du" xmlns:w16sdtdh="http://schemas.microsoft.com/office/word/2020/wordml/sdtdatahash" xmlns:w16sdtfl="http://schemas.microsoft.com/office/word/2024/wordml/sdtformatlock" xmlns:w16se="http://schemas.microsoft.com/office/word/2015/wordml/symex" xmlns:wpg="http://schemas.microsoft.com/office/word/2010/wordprocessingGroup" xmlns:wpi="http://schemas.microsoft.com/office/word/2010/wordprocessingInk" xmlns:wne="http://schemas.microsoft.com/office/word/2006/wordml" xmlns:wps="http://schemas.microsoft.com/office/word/2010/wordprocessingShape" mc:Ignorable="w14 w15 w16se w16cid w16 w16cex w16sdtdh w16sdtfl w16du wp14">
   <w:body>
     <w:p>
       <w:pPr>
@@ -277,7 +277,6 @@
         <w:tc>
           <w:tcPr>
             <w:tcW w:w="4048" w:type="dxa"/>
-            <w:shd w:val="clear" w:color="auto" w:fill="auto"/>
           </w:tcPr>
           <w:p>
             <w:pPr>
@@ -326,17 +325,17 @@
                 <w:sz w:val="28"/>
                 <w:szCs w:val="32"/>
               </w:rPr>
-              <w:t>7</w:t>
-            </w:r>
-            <w:r>
-              <w:rPr>
-                <w:rFonts w:cs="Arial"/>
-                <w:b/>
-                <w:color w:val="000000"/>
-                <w:sz w:val="28"/>
-                <w:szCs w:val="32"/>
-              </w:rPr>
-              <w:t xml:space="preserve">.3 </w:t>
+              <w:t>3.6</w:t>
+            </w:r>
+            <w:r>
+              <w:rPr>
+                <w:rFonts w:cs="Arial"/>
+                <w:b/>
+                <w:color w:val="000000"/>
+                <w:sz w:val="28"/>
+                <w:szCs w:val="32"/>
+              </w:rPr>
+              <w:t xml:space="preserve"> </w:t>
             </w:r>
             <w:r>
               <w:rPr>
@@ -386,9 +385,82 @@
                 <w:sz w:val="28"/>
                 <w:szCs w:val="32"/>
               </w:rPr>
-              <w:t>49</w:t>
-            </w:r>
-          </w:p>
+              <w:t>3</w:t>
+            </w:r>
+            <w:r>
+              <w:rPr>
+                <w:rFonts w:cs="Arial"/>
+                <w:b/>
+                <w:color w:val="000000"/>
+                <w:sz w:val="28"/>
+                <w:szCs w:val="32"/>
+              </w:rPr>
+              <w:t>9</w:t>
+            </w:r>
+          </w:p>
+          <w:p>
+            <w:pPr>
+              <w:widowControl w:val="0"/>
+              <w:tabs>
+                <w:tab w:val="left" w:pos="993"/>
+              </w:tabs>
+              <w:autoSpaceDE w:val="0"/>
+              <w:autoSpaceDN w:val="0"/>
+              <w:adjustRightInd w:val="0"/>
+              <w:spacing w:before="0" w:line="252" w:lineRule="auto"/>
+              <w:ind w:right="297"/>
+              <w:rPr>
+                <w:rFonts w:cs="Arial"/>
+                <w:b/>
+                <w:color w:val="000000"/>
+                <w:sz w:val="28"/>
+                <w:szCs w:val="32"/>
+              </w:rPr>
+            </w:pPr>
+            <w:r>
+              <w:rPr>
+                <w:rFonts w:cs="Arial"/>
+                <w:b/>
+                <w:color w:val="000000"/>
+                <w:sz w:val="28"/>
+                <w:szCs w:val="32"/>
+              </w:rPr>
+              <w:t>Panchaati No</w:t>
+            </w:r>
+            <w:r>
+              <w:rPr>
+                <w:rFonts w:cs="Arial"/>
+                <w:b/>
+                <w:color w:val="000000"/>
+                <w:szCs w:val="32"/>
+              </w:rPr>
+              <w:t>. -</w:t>
+            </w:r>
+            <w:r>
+              <w:rPr>
+                <w:rFonts w:cs="Arial"/>
+                <w:b/>
+                <w:color w:val="000000"/>
+                <w:szCs w:val="32"/>
+              </w:rPr>
+              <w:t xml:space="preserve"> </w:t>
+            </w:r>
+            <w:r>
+              <w:rPr>
+                <w:rFonts w:cs="Arial"/>
+                <w:b/>
+                <w:color w:val="000000"/>
+                <w:sz w:val="28"/>
+                <w:szCs w:val="32"/>
+              </w:rPr>
+              <w:t>12</w:t>
+            </w:r>
+          </w:p>
+        </w:tc>
+        <w:tc>
+          <w:tcPr>
+            <w:tcW w:w="4819" w:type="dxa"/>
+          </w:tcPr>
           <w:p>
             <w:pPr>
               <w:widowControl w:val="0"/>
@@ -397,57 +469,82 @@
               <w:adjustRightInd w:val="0"/>
               <w:spacing w:before="0" w:line="240" w:lineRule="auto"/>
               <w:rPr>
-                <w:rFonts w:cs="Arial"/>
-                <w:bCs/>
-                <w:sz w:val="36"/>
-                <w:szCs w:val="36"/>
-                <w:lang w:bidi="ml-IN"/>
-              </w:rPr>
-            </w:pPr>
-            <w:r>
-              <w:rPr>
-                <w:rFonts w:cs="Arial"/>
-                <w:b/>
-                <w:color w:val="000000"/>
-                <w:sz w:val="28"/>
-                <w:szCs w:val="32"/>
-              </w:rPr>
-              <w:t>Panchaati No</w:t>
-            </w:r>
-            <w:r>
-              <w:rPr>
-                <w:rFonts w:cs="Arial"/>
-                <w:b/>
-                <w:color w:val="000000"/>
-                <w:szCs w:val="32"/>
-              </w:rPr>
-              <w:t>. -</w:t>
-            </w:r>
-            <w:r>
-              <w:rPr>
-                <w:rFonts w:cs="Arial"/>
-                <w:b/>
-                <w:color w:val="000000"/>
-                <w:szCs w:val="32"/>
-              </w:rPr>
-              <w:t xml:space="preserve"> </w:t>
-            </w:r>
-            <w:r>
-              <w:rPr>
-                <w:rFonts w:cs="Arial"/>
-                <w:b/>
-                <w:color w:val="000000"/>
-                <w:sz w:val="28"/>
-                <w:szCs w:val="32"/>
-              </w:rPr>
-              <w:t>21</w:t>
+                <w:rFonts w:ascii="BRH Malayalam Extra" w:eastAsia="Times New Roman" w:hAnsi="BRH Malayalam Extra" w:cs="BRH Malayalam Extra"/>
+                <w:color w:val="000000"/>
+                <w:sz w:val="40"/>
+                <w:szCs w:val="40"/>
+                <w:lang w:val="en-IN" w:eastAsia="en-IN" w:bidi="ml-IN"/>
+              </w:rPr>
+            </w:pPr>
+            <w:r>
+              <w:rPr>
+                <w:rFonts w:ascii="BRH Malayalam Extra" w:eastAsia="Times New Roman" w:hAnsi="BRH Malayalam Extra" w:cs="BRH Malayalam Extra"/>
+                <w:color w:val="000000"/>
+                <w:sz w:val="40"/>
+                <w:szCs w:val="40"/>
+                <w:lang w:val="en-IN" w:eastAsia="en-IN" w:bidi="ml-IN"/>
+              </w:rPr>
+              <w:t>A</w:t>
+            </w:r>
+            <w:r>
+              <w:rPr>
+                <w:rFonts w:ascii="BRH Malayalam Extra" w:eastAsia="Times New Roman" w:hAnsi="BRH Malayalam Extra" w:cs="BRH Malayalam Extra"/>
+                <w:color w:val="000000"/>
+                <w:sz w:val="40"/>
+                <w:szCs w:val="40"/>
+                <w:highlight w:val="yellow"/>
+                <w:lang w:val="en-IN" w:eastAsia="en-IN" w:bidi="ml-IN"/>
+              </w:rPr>
+              <w:t>dûy</w:t>
+            </w:r>
+            <w:r>
+              <w:rPr>
+                <w:rFonts w:ascii="BRH Malayalam Extra" w:eastAsia="Times New Roman" w:hAnsi="BRH Malayalam Extra" w:cs="BRH Malayalam Extra"/>
+                <w:b/>
+                <w:color w:val="000000"/>
+                <w:sz w:val="33"/>
+                <w:szCs w:val="40"/>
+                <w:highlight w:val="yellow"/>
+                <w:lang w:val="en-IN" w:eastAsia="en-IN" w:bidi="ml-IN"/>
+              </w:rPr>
+              <w:t>–</w:t>
+            </w:r>
+            <w:r>
+              <w:rPr>
+                <w:rFonts w:ascii="BRH Malayalam Extra" w:eastAsia="Times New Roman" w:hAnsi="BRH Malayalam Extra" w:cs="BRH Malayalam Extra"/>
+                <w:color w:val="000000"/>
+                <w:sz w:val="40"/>
+                <w:szCs w:val="40"/>
+                <w:lang w:val="en-IN" w:eastAsia="en-IN" w:bidi="ml-IN"/>
+              </w:rPr>
+              <w:t>ty | C</w:t>
+            </w:r>
+            <w:r>
+              <w:rPr>
+                <w:rFonts w:ascii="BRH Malayalam Extra" w:eastAsia="Times New Roman" w:hAnsi="BRH Malayalam Extra" w:cs="BRH Malayalam Extra"/>
+                <w:b/>
+                <w:color w:val="000000"/>
+                <w:sz w:val="33"/>
+                <w:szCs w:val="40"/>
+                <w:lang w:val="en-IN" w:eastAsia="en-IN" w:bidi="ml-IN"/>
+              </w:rPr>
+              <w:t>–</w:t>
+            </w:r>
+            <w:r>
+              <w:rPr>
+                <w:rFonts w:ascii="BRH Malayalam Extra" w:eastAsia="Times New Roman" w:hAnsi="BRH Malayalam Extra" w:cs="BRH Malayalam Extra"/>
+                <w:color w:val="000000"/>
+                <w:sz w:val="40"/>
+                <w:szCs w:val="40"/>
+                <w:lang w:val="en-IN" w:eastAsia="en-IN" w:bidi="ml-IN"/>
+              </w:rPr>
+              <w:t>tzZy— |</w:t>
             </w:r>
           </w:p>
         </w:tc>
         <w:tc>
           <w:tcPr>
-            <w:tcW w:w="4819" w:type="dxa"/>
-            <w:shd w:val="clear" w:color="auto" w:fill="auto"/>
+            <w:tcW w:w="5103" w:type="dxa"/>
           </w:tcPr>
           <w:p>
             <w:pPr>
@@ -456,24 +553,44 @@
               <w:autoSpaceDN w:val="0"/>
               <w:adjustRightInd w:val="0"/>
               <w:spacing w:before="0" w:line="240" w:lineRule="auto"/>
-              <w:jc w:val="center"/>
-              <w:rPr>
-                <w:rFonts w:ascii="BRH Devanagari Extra" w:hAnsi="BRH Devanagari Extra" w:cs="BRH Devanagari Extra"/>
-                <w:color w:val="000000"/>
-                <w:sz w:val="36"/>
-                <w:szCs w:val="40"/>
-                <w:lang w:bidi="ml-IN"/>
-              </w:rPr>
-            </w:pPr>
-            <w:r>
-              <w:rPr>
-                <w:rFonts w:ascii="BRH Malayalam Extra" w:eastAsia="Times New Roman" w:hAnsi="BRH Malayalam Extra" w:cs="BRH Malayalam Extra"/>
-                <w:color w:val="000000"/>
-                <w:sz w:val="40"/>
-                <w:szCs w:val="40"/>
-                <w:lang w:val="en-IN" w:eastAsia="en-IN" w:bidi="ml-IN"/>
-              </w:rPr>
-              <w:t>qªi— jPâ | j</w:t>
+              <w:rPr>
+                <w:rFonts w:ascii="BRH Malayalam Extra" w:eastAsia="Times New Roman" w:hAnsi="BRH Malayalam Extra" w:cs="BRH Malayalam Extra"/>
+                <w:color w:val="000000"/>
+                <w:sz w:val="40"/>
+                <w:szCs w:val="40"/>
+                <w:lang w:val="en-IN" w:eastAsia="en-IN" w:bidi="ml-IN"/>
+              </w:rPr>
+            </w:pPr>
+            <w:r>
+              <w:rPr>
+                <w:rFonts w:ascii="BRH Malayalam Extra" w:eastAsia="Times New Roman" w:hAnsi="BRH Malayalam Extra" w:cs="BRH Malayalam Extra"/>
+                <w:color w:val="000000"/>
+                <w:sz w:val="40"/>
+                <w:szCs w:val="40"/>
+                <w:lang w:val="en-IN" w:eastAsia="en-IN" w:bidi="ml-IN"/>
+              </w:rPr>
+              <w:t>A</w:t>
+            </w:r>
+            <w:r>
+              <w:rPr>
+                <w:rFonts w:ascii="BRH Malayalam Extra" w:eastAsia="Times New Roman" w:hAnsi="BRH Malayalam Extra" w:cs="BRH Malayalam Extra"/>
+                <w:color w:val="000000"/>
+                <w:sz w:val="40"/>
+                <w:szCs w:val="40"/>
+                <w:highlight w:val="green"/>
+                <w:lang w:val="en-IN" w:eastAsia="en-IN" w:bidi="ml-IN"/>
+              </w:rPr>
+              <w:t>dûy</w:t>
+            </w:r>
+            <w:r>
+              <w:rPr>
+                <w:rFonts w:ascii="BRH Malayalam Extra" w:eastAsia="Times New Roman" w:hAnsi="BRH Malayalam Extra" w:cs="BRH Malayalam Extra"/>
+                <w:color w:val="000000"/>
+                <w:sz w:val="40"/>
+                <w:szCs w:val="40"/>
+                <w:lang w:val="en-IN" w:eastAsia="en-IN" w:bidi="ml-IN"/>
+              </w:rPr>
+              <w:t>—ty | C</w:t>
             </w:r>
             <w:r>
               <w:rPr>
@@ -482,51 +599,121 @@
                 <w:color w:val="000000"/>
                 <w:sz w:val="33"/>
                 <w:szCs w:val="40"/>
-                <w:highlight w:val="yellow"/>
-                <w:lang w:val="en-IN" w:eastAsia="en-IN" w:bidi="ml-IN"/>
-              </w:rPr>
-              <w:t>–</w:t>
-            </w:r>
-            <w:r>
-              <w:rPr>
-                <w:rFonts w:ascii="BRH Malayalam Extra" w:eastAsia="Times New Roman" w:hAnsi="BRH Malayalam Extra" w:cs="BRH Malayalam Extra"/>
-                <w:color w:val="000000"/>
-                <w:sz w:val="40"/>
-                <w:szCs w:val="40"/>
-                <w:highlight w:val="yellow"/>
-                <w:lang w:val="en-IN" w:eastAsia="en-IN" w:bidi="ml-IN"/>
-              </w:rPr>
-              <w:t>¥Pâ</w:t>
-            </w:r>
-            <w:r>
-              <w:rPr>
-                <w:rFonts w:ascii="BRH Malayalam Extra" w:eastAsia="Times New Roman" w:hAnsi="BRH Malayalam Extra" w:cs="BRH Malayalam Extra"/>
-                <w:b/>
-                <w:color w:val="000000"/>
-                <w:sz w:val="33"/>
-                <w:szCs w:val="40"/>
-                <w:highlight w:val="yellow"/>
-                <w:lang w:val="en-IN" w:eastAsia="en-IN" w:bidi="ml-IN"/>
-              </w:rPr>
-              <w:t>–</w:t>
-            </w:r>
-            <w:r>
-              <w:rPr>
-                <w:rFonts w:ascii="BRH Malayalam Extra" w:eastAsia="Times New Roman" w:hAnsi="BRH Malayalam Extra" w:cs="BRH Malayalam Extra"/>
-                <w:color w:val="000000"/>
-                <w:sz w:val="40"/>
-                <w:szCs w:val="40"/>
-                <w:lang w:val="en-IN" w:eastAsia="en-IN" w:bidi="ml-IN"/>
-              </w:rPr>
-              <w:t>Zy— jPâ ||</w:t>
+                <w:lang w:val="en-IN" w:eastAsia="en-IN" w:bidi="ml-IN"/>
+              </w:rPr>
+              <w:t>–</w:t>
+            </w:r>
+            <w:r>
+              <w:rPr>
+                <w:rFonts w:ascii="BRH Malayalam Extra" w:eastAsia="Times New Roman" w:hAnsi="BRH Malayalam Extra" w:cs="BRH Malayalam Extra"/>
+                <w:color w:val="000000"/>
+                <w:sz w:val="40"/>
+                <w:szCs w:val="40"/>
+                <w:lang w:val="en-IN" w:eastAsia="en-IN" w:bidi="ml-IN"/>
+              </w:rPr>
+              <w:t>tzZy— |</w:t>
             </w:r>
           </w:p>
         </w:tc>
+      </w:tr>
+      <w:tr>
+        <w:trPr>
+          <w:trHeight w:val="918"/>
+        </w:trPr>
         <w:tc>
           <w:tcPr>
-            <w:tcW w:w="5103" w:type="dxa"/>
-            <w:shd w:val="clear" w:color="auto" w:fill="auto"/>
+            <w:tcW w:w="4048" w:type="dxa"/>
           </w:tcPr>
+          <w:p>
+            <w:pPr>
+              <w:widowControl w:val="0"/>
+              <w:tabs>
+                <w:tab w:val="left" w:pos="993"/>
+              </w:tabs>
+              <w:autoSpaceDE w:val="0"/>
+              <w:autoSpaceDN w:val="0"/>
+              <w:adjustRightInd w:val="0"/>
+              <w:spacing w:before="0" w:line="252" w:lineRule="auto"/>
+              <w:ind w:right="297"/>
+              <w:rPr>
+                <w:rFonts w:cs="Arial"/>
+                <w:b/>
+                <w:color w:val="000000"/>
+                <w:sz w:val="28"/>
+                <w:szCs w:val="32"/>
+              </w:rPr>
+            </w:pPr>
+            <w:r>
+              <w:rPr>
+                <w:rFonts w:cs="Arial"/>
+                <w:b/>
+                <w:color w:val="000000"/>
+                <w:sz w:val="28"/>
+                <w:szCs w:val="32"/>
+              </w:rPr>
+              <w:t>T.S.</w:t>
+            </w:r>
+            <w:r>
+              <w:rPr>
+                <w:rFonts w:cs="Arial"/>
+                <w:b/>
+                <w:color w:val="000000"/>
+                <w:sz w:val="28"/>
+                <w:szCs w:val="32"/>
+              </w:rPr>
+              <w:t xml:space="preserve">3.4.7.3 </w:t>
+            </w:r>
+            <w:r>
+              <w:rPr>
+                <w:rFonts w:cs="Arial"/>
+                <w:b/>
+                <w:color w:val="000000"/>
+                <w:sz w:val="28"/>
+                <w:szCs w:val="32"/>
+              </w:rPr>
+              <w:t>– Kramam</w:t>
+            </w:r>
+          </w:p>
+          <w:p>
+            <w:pPr>
+              <w:widowControl w:val="0"/>
+              <w:tabs>
+                <w:tab w:val="left" w:pos="993"/>
+              </w:tabs>
+              <w:autoSpaceDE w:val="0"/>
+              <w:autoSpaceDN w:val="0"/>
+              <w:adjustRightInd w:val="0"/>
+              <w:spacing w:before="0" w:line="252" w:lineRule="auto"/>
+              <w:ind w:right="297"/>
+              <w:rPr>
+                <w:rFonts w:cs="Arial"/>
+                <w:b/>
+                <w:color w:val="000000"/>
+                <w:sz w:val="28"/>
+                <w:szCs w:val="32"/>
+              </w:rPr>
+            </w:pPr>
+            <w:r>
+              <w:rPr>
+                <w:rFonts w:cs="Arial"/>
+                <w:b/>
+                <w:color w:val="000000"/>
+                <w:sz w:val="28"/>
+                <w:szCs w:val="32"/>
+              </w:rPr>
+              <w:t xml:space="preserve">Krama Vaakyam No. - </w:t>
+            </w:r>
+            <w:r>
+              <w:rPr>
+                <w:rFonts w:cs="Arial"/>
+                <w:b/>
+                <w:color w:val="000000"/>
+                <w:sz w:val="28"/>
+                <w:szCs w:val="32"/>
+              </w:rPr>
+              <w:t>49</w:t>
+            </w:r>
+          </w:p>
           <w:p>
             <w:pPr>
               <w:widowControl w:val="0"/>
@@ -534,7 +721,141 @@
               <w:autoSpaceDN w:val="0"/>
               <w:adjustRightInd w:val="0"/>
               <w:spacing w:before="0" w:line="240" w:lineRule="auto"/>
-              <w:jc w:val="center"/>
+              <w:rPr>
+                <w:rFonts w:cs="Arial"/>
+                <w:bCs/>
+                <w:sz w:val="36"/>
+                <w:szCs w:val="36"/>
+                <w:lang w:bidi="ml-IN"/>
+              </w:rPr>
+            </w:pPr>
+            <w:r>
+              <w:rPr>
+                <w:rFonts w:cs="Arial"/>
+                <w:b/>
+                <w:color w:val="000000"/>
+                <w:sz w:val="28"/>
+                <w:szCs w:val="32"/>
+              </w:rPr>
+              <w:t>Panchaati No</w:t>
+            </w:r>
+            <w:r>
+              <w:rPr>
+                <w:rFonts w:cs="Arial"/>
+                <w:b/>
+                <w:color w:val="000000"/>
+                <w:szCs w:val="32"/>
+              </w:rPr>
+              <w:t>. -</w:t>
+            </w:r>
+            <w:r>
+              <w:rPr>
+                <w:rFonts w:cs="Arial"/>
+                <w:b/>
+                <w:color w:val="000000"/>
+                <w:szCs w:val="32"/>
+              </w:rPr>
+              <w:t xml:space="preserve"> </w:t>
+            </w:r>
+            <w:r>
+              <w:rPr>
+                <w:rFonts w:cs="Arial"/>
+                <w:b/>
+                <w:color w:val="000000"/>
+                <w:sz w:val="28"/>
+                <w:szCs w:val="32"/>
+              </w:rPr>
+              <w:t>21</w:t>
+            </w:r>
+          </w:p>
+        </w:tc>
+        <w:tc>
+          <w:tcPr>
+            <w:tcW w:w="4819" w:type="dxa"/>
+          </w:tcPr>
+          <w:p>
+            <w:pPr>
+              <w:widowControl w:val="0"/>
+              <w:autoSpaceDE w:val="0"/>
+              <w:autoSpaceDN w:val="0"/>
+              <w:adjustRightInd w:val="0"/>
+              <w:spacing w:before="0" w:line="240" w:lineRule="auto"/>
+              <w:rPr>
+                <w:rFonts w:ascii="BRH Devanagari Extra" w:hAnsi="BRH Devanagari Extra" w:cs="BRH Devanagari Extra"/>
+                <w:color w:val="000000"/>
+                <w:sz w:val="36"/>
+                <w:szCs w:val="40"/>
+                <w:lang w:bidi="ml-IN"/>
+              </w:rPr>
+            </w:pPr>
+            <w:r>
+              <w:rPr>
+                <w:rFonts w:ascii="BRH Malayalam Extra" w:eastAsia="Times New Roman" w:hAnsi="BRH Malayalam Extra" w:cs="BRH Malayalam Extra"/>
+                <w:color w:val="000000"/>
+                <w:sz w:val="40"/>
+                <w:szCs w:val="40"/>
+                <w:lang w:val="en-IN" w:eastAsia="en-IN" w:bidi="ml-IN"/>
+              </w:rPr>
+              <w:t>qªi— jPâ | j</w:t>
+            </w:r>
+            <w:r>
+              <w:rPr>
+                <w:rFonts w:ascii="BRH Malayalam Extra" w:eastAsia="Times New Roman" w:hAnsi="BRH Malayalam Extra" w:cs="BRH Malayalam Extra"/>
+                <w:b/>
+                <w:color w:val="000000"/>
+                <w:sz w:val="33"/>
+                <w:szCs w:val="40"/>
+                <w:highlight w:val="yellow"/>
+                <w:lang w:val="en-IN" w:eastAsia="en-IN" w:bidi="ml-IN"/>
+              </w:rPr>
+              <w:t>–</w:t>
+            </w:r>
+            <w:r>
+              <w:rPr>
+                <w:rFonts w:ascii="BRH Malayalam Extra" w:eastAsia="Times New Roman" w:hAnsi="BRH Malayalam Extra" w:cs="BRH Malayalam Extra"/>
+                <w:color w:val="000000"/>
+                <w:sz w:val="40"/>
+                <w:szCs w:val="40"/>
+                <w:highlight w:val="yellow"/>
+                <w:lang w:val="en-IN" w:eastAsia="en-IN" w:bidi="ml-IN"/>
+              </w:rPr>
+              <w:t>¥Pâ</w:t>
+            </w:r>
+            <w:r>
+              <w:rPr>
+                <w:rFonts w:ascii="BRH Malayalam Extra" w:eastAsia="Times New Roman" w:hAnsi="BRH Malayalam Extra" w:cs="BRH Malayalam Extra"/>
+                <w:b/>
+                <w:color w:val="000000"/>
+                <w:sz w:val="33"/>
+                <w:szCs w:val="40"/>
+                <w:highlight w:val="yellow"/>
+                <w:lang w:val="en-IN" w:eastAsia="en-IN" w:bidi="ml-IN"/>
+              </w:rPr>
+              <w:t>–</w:t>
+            </w:r>
+            <w:r>
+              <w:rPr>
+                <w:rFonts w:ascii="BRH Malayalam Extra" w:eastAsia="Times New Roman" w:hAnsi="BRH Malayalam Extra" w:cs="BRH Malayalam Extra"/>
+                <w:color w:val="000000"/>
+                <w:sz w:val="40"/>
+                <w:szCs w:val="40"/>
+                <w:lang w:val="en-IN" w:eastAsia="en-IN" w:bidi="ml-IN"/>
+              </w:rPr>
+              <w:t>Zy— jPâ ||</w:t>
+            </w:r>
+          </w:p>
+        </w:tc>
+        <w:tc>
+          <w:tcPr>
+            <w:tcW w:w="5103" w:type="dxa"/>
+          </w:tcPr>
+          <w:p>
+            <w:pPr>
+              <w:widowControl w:val="0"/>
+              <w:autoSpaceDE w:val="0"/>
+              <w:autoSpaceDN w:val="0"/>
+              <w:adjustRightInd w:val="0"/>
+              <w:spacing w:before="0" w:line="240" w:lineRule="auto"/>
               <w:rPr>
                 <w:rFonts w:ascii="BRH Devanagari Extra" w:hAnsi="BRH Devanagari Extra" w:cs="BRH Devanagari Extra"/>
                 <w:color w:val="000000"/>
@@ -596,7 +917,6 @@
         <w:tc>
           <w:tcPr>
             <w:tcW w:w="4048" w:type="dxa"/>
-            <w:shd w:val="clear" w:color="auto" w:fill="auto"/>
           </w:tcPr>
           <w:p>
             <w:pPr>
@@ -635,27 +955,7 @@
                 <w:sz w:val="28"/>
                 <w:szCs w:val="32"/>
               </w:rPr>
-              <w:t>3.4.</w:t>
-            </w:r>
-            <w:r>
-              <w:rPr>
-                <w:rFonts w:cs="Arial"/>
-                <w:b/>
-                <w:color w:val="000000"/>
-                <w:sz w:val="28"/>
-                <w:szCs w:val="32"/>
-              </w:rPr>
-              <w:t>11</w:t>
-            </w:r>
-            <w:r>
-              <w:rPr>
-                <w:rFonts w:cs="Arial"/>
-                <w:b/>
-                <w:color w:val="000000"/>
-                <w:sz w:val="28"/>
-                <w:szCs w:val="32"/>
-              </w:rPr>
-              <w:t xml:space="preserve">.3 </w:t>
+              <w:t xml:space="preserve">3.4.11.3 </w:t>
             </w:r>
             <w:r>
               <w:rPr>
@@ -770,7 +1070,6 @@
         <w:tc>
           <w:tcPr>
             <w:tcW w:w="4819" w:type="dxa"/>
-            <w:shd w:val="clear" w:color="auto" w:fill="auto"/>
           </w:tcPr>
           <w:p>
             <w:pPr>
@@ -934,7 +1233,6 @@
         <w:tc>
           <w:tcPr>
             <w:tcW w:w="5103" w:type="dxa"/>
-            <w:shd w:val="clear" w:color="auto" w:fill="auto"/>
           </w:tcPr>
           <w:p>
             <w:pPr>
@@ -1092,7 +1390,6 @@
         <w:tc>
           <w:tcPr>
             <w:tcW w:w="4048" w:type="dxa"/>
-            <w:shd w:val="clear" w:color="auto" w:fill="auto"/>
           </w:tcPr>
           <w:p>
             <w:pPr>
@@ -1161,30 +1458,19 @@
                 <w:color w:val="000000"/>
                 <w:sz w:val="28"/>
                 <w:szCs w:val="32"/>
-                <w:lang w:val="it-IT"/>
-              </w:rPr>
-            </w:pPr>
-            <w:r>
-              <w:rPr>
-                <w:rFonts w:cs="Arial"/>
-                <w:b/>
-                <w:color w:val="000000"/>
-                <w:sz w:val="28"/>
-                <w:szCs w:val="32"/>
-                <w:lang w:val="it-IT"/>
-              </w:rPr>
-              <w:t xml:space="preserve">Krama Vaakyam No. - </w:t>
-            </w:r>
-            <w:r>
-              <w:rPr>
-                <w:rFonts w:cs="Arial"/>
-                <w:b/>
-                <w:color w:val="000000"/>
-                <w:sz w:val="28"/>
-                <w:szCs w:val="32"/>
-                <w:lang w:val="it-IT"/>
-              </w:rPr>
-              <w:t>52</w:t>
+                <w:lang w:val="en-IN"/>
+              </w:rPr>
+            </w:pPr>
+            <w:r>
+              <w:rPr>
+                <w:rFonts w:cs="Arial"/>
+                <w:b/>
+                <w:color w:val="000000"/>
+                <w:sz w:val="28"/>
+                <w:szCs w:val="32"/>
+                <w:lang w:val="en-IN"/>
+              </w:rPr>
+              <w:t>Krama Vaakyam No. - 52</w:t>
             </w:r>
           </w:p>
           <w:p>
@@ -1244,7 +1530,6 @@
         <w:tc>
           <w:tcPr>
             <w:tcW w:w="4819" w:type="dxa"/>
-            <w:shd w:val="clear" w:color="auto" w:fill="auto"/>
           </w:tcPr>
           <w:p>
             <w:pPr>
@@ -1429,7 +1714,6 @@
         <w:tc>
           <w:tcPr>
             <w:tcW w:w="5103" w:type="dxa"/>
-            <w:shd w:val="clear" w:color="auto" w:fill="auto"/>
           </w:tcPr>
           <w:p>
             <w:pPr>
@@ -1851,6 +2135,7 @@
                 <w:sz w:val="32"/>
                 <w:szCs w:val="32"/>
               </w:rPr>
+              <w:lastRenderedPageBreak/>
               <w:t>Reference</w:t>
             </w:r>
           </w:p>
@@ -1873,6 +2158,7 @@
                 <w:sz w:val="32"/>
                 <w:szCs w:val="32"/>
               </w:rPr>
+              <w:lastRenderedPageBreak/>
               <w:t>As Printed</w:t>
             </w:r>
           </w:p>
@@ -1938,7 +2224,6 @@
         <w:tc>
           <w:tcPr>
             <w:tcW w:w="4048" w:type="dxa"/>
-            <w:shd w:val="clear" w:color="auto" w:fill="auto"/>
           </w:tcPr>
           <w:p>
             <w:pPr>
@@ -1964,7 +2249,6 @@
                 <w:szCs w:val="36"/>
                 <w:lang w:bidi="ml-IN"/>
               </w:rPr>
-              <w:lastRenderedPageBreak/>
               <w:t>None</w:t>
             </w:r>
           </w:p>
@@ -1972,7 +2256,6 @@
         <w:tc>
           <w:tcPr>
             <w:tcW w:w="4819" w:type="dxa"/>
-            <w:shd w:val="clear" w:color="auto" w:fill="auto"/>
           </w:tcPr>
           <w:p>
             <w:pPr>
@@ -2005,7 +2288,6 @@
         <w:tc>
           <w:tcPr>
             <w:tcW w:w="5103" w:type="dxa"/>
-            <w:shd w:val="clear" w:color="auto" w:fill="auto"/>
           </w:tcPr>
           <w:p>
             <w:pPr>
@@ -3568,6 +3850,7 @@
                 <w:sz w:val="28"/>
                 <w:szCs w:val="32"/>
               </w:rPr>
+              <w:lastRenderedPageBreak/>
               <w:t>T.S.3.4.6.1 – Kramam</w:t>
             </w:r>
           </w:p>
@@ -3963,7 +4246,6 @@
                 <w:sz w:val="28"/>
                 <w:szCs w:val="32"/>
               </w:rPr>
-              <w:lastRenderedPageBreak/>
               <w:t>T.S.</w:t>
             </w:r>
             <w:r>
@@ -6651,6 +6933,7 @@
           <w:szCs w:val="32"/>
           <w:u w:val="single"/>
         </w:rPr>
+        <w:lastRenderedPageBreak/>
         <w:t xml:space="preserve">TS Krama Paatam – TS </w:t>
       </w:r>
       <w:r>
@@ -6772,7 +7055,6 @@
                 <w:sz w:val="32"/>
                 <w:szCs w:val="32"/>
               </w:rPr>
-              <w:lastRenderedPageBreak/>
               <w:t>Reference</w:t>
             </w:r>
           </w:p>
@@ -6795,7 +7077,6 @@
                 <w:sz w:val="32"/>
                 <w:szCs w:val="32"/>
               </w:rPr>
-              <w:lastRenderedPageBreak/>
               <w:t>As Printed</w:t>
             </w:r>
           </w:p>
@@ -6955,7 +7236,7 @@
 </file>
 
 <file path=word/endnotes.xml><?xml version="1.0" encoding="utf-8"?>
-<w:endnotes xmlns:wpc="http://schemas.microsoft.com/office/word/2010/wordprocessingCanvas" xmlns:cx="http://schemas.microsoft.com/office/drawing/2014/chartex" xmlns:cx1="http://schemas.microsoft.com/office/drawing/2015/9/8/chartex" xmlns:cx2="http://schemas.microsoft.com/office/drawing/2015/10/21/chartex" xmlns:cx3="http://schemas.microsoft.com/office/drawing/2016/5/9/chartex" xmlns:cx4="http://schemas.microsoft.com/office/drawing/2016/5/10/chartex" xmlns:cx5="http://schemas.microsoft.com/office/drawing/2016/5/11/chartex" xmlns:cx6="http://schemas.microsoft.com/office/drawing/2016/5/12/chartex" xmlns:cx7="http://schemas.microsoft.com/office/drawing/2016/5/13/chartex" xmlns:cx8="http://schemas.microsoft.com/office/drawing/2016/5/14/chartex" xmlns:mc="http://schemas.openxmlformats.org/markup-compatibility/2006" xmlns:aink="http://schemas.microsoft.com/office/drawing/2016/ink" xmlns:am3d="http://schemas.microsoft.com/office/drawing/2017/model3d" xmlns:o="urn:schemas-microsoft-com:office:office" xmlns:oel="http://schemas.microsoft.com/office/2019/extlst" xmlns:r="http://schemas.openxmlformats.org/officeDocument/2006/relationships" xmlns:m="http://schemas.openxmlformats.org/officeDocument/2006/math" xmlns:v="urn:schemas-microsoft-com:vml" xmlns:wp14="http://schemas.microsoft.com/office/word/2010/wordprocessingDrawing" xmlns:wp="http://schemas.openxmlformats.org/drawingml/2006/wordprocessingDrawing" xmlns:w10="urn:schemas-microsoft-com:office:word" xmlns:w="http://schemas.openxmlformats.org/wordprocessingml/2006/main" xmlns:w14="http://schemas.microsoft.com/office/word/2010/wordml" xmlns:w15="http://schemas.microsoft.com/office/word/2012/wordml" xmlns:w16cex="http://schemas.microsoft.com/office/word/2018/wordml/cex" xmlns:w16cid="http://schemas.microsoft.com/office/word/2016/wordml/cid" xmlns:w16="http://schemas.microsoft.com/office/word/2018/wordml" xmlns:w16du="http://schemas.microsoft.com/office/word/2023/wordml/word16du" xmlns:w16sdtdh="http://schemas.microsoft.com/office/word/2020/wordml/sdtdatahash" xmlns:w16sdtfl="http://schemas.microsoft.com/office/word/2024/wordml/sdtformatlock" xmlns:w16se="http://schemas.microsoft.com/office/word/2015/wordml/symex" xmlns:wpg="http://schemas.microsoft.com/office/word/2010/wordprocessingGroup" xmlns:wpi="http://schemas.microsoft.com/office/word/2010/wordprocessingInk" xmlns:wne="http://schemas.microsoft.com/office/word/2006/wordml" xmlns:wps="http://schemas.microsoft.com/office/word/2010/wordprocessingShape" mc:Ignorable="w14 w15 w16se w16cid w16 w16cex w16sdtdh w16sdtfl w16du wp14">
+<w:endnotes xmlns:wpc="http://schemas.microsoft.com/office/word/2010/wordprocessingCanvas" xmlns:cx="http://schemas.microsoft.com/office/drawing/2014/chartex" xmlns:cx1="http://schemas.microsoft.com/office/drawing/2015/9/8/chartex" xmlns:cx2="http://schemas.microsoft.com/office/drawing/2015/10/21/chartex" xmlns:cx3="http://schemas.microsoft.com/office/drawing/2016/5/9/chartex" xmlns:cx4="http://schemas.microsoft.com/office/drawing/2016/5/10/chartex" xmlns:cx5="http://schemas.microsoft.com/office/drawing/2016/5/11/chartex" xmlns:cx6="http://schemas.microsoft.com/office/drawing/2016/5/12/chartex" xmlns:cx7="http://schemas.microsoft.com/office/drawing/2016/5/13/chartex" xmlns:cx8="http://schemas.microsoft.com/office/drawing/2016/5/14/chartex" xmlns:mc="http://schemas.openxmlformats.org/markup-compatibility/2006" xmlns:aink="http://schemas.microsoft.com/office/drawing/2016/ink" xmlns:am3d="http://schemas.microsoft.com/office/drawing/2017/model3d" xmlns:o="urn:schemas-microsoft-com:office:office" xmlns:oel="http://schemas.microsoft.com/office/2019/extlst" xmlns:r="http://schemas.openxmlformats.org/officeDocument/2006/relationships" xmlns:m="http://schemas.openxmlformats.org/officeDocument/2006/math" xmlns:v="urn:schemas-microsoft-com:vml" xmlns:wp14="http://schemas.microsoft.com/office/word/2010/wordprocessingDrawing" xmlns:wp="http://schemas.openxmlformats.org/drawingml/2006/wordprocessingDrawing" xmlns:w10="urn:schemas-microsoft-com:office:word" xmlns:w="http://schemas.openxmlformats.org/wordprocessingml/2006/main" xmlns:w14="http://schemas.microsoft.com/office/word/2010/wordml" xmlns:w15="http://schemas.microsoft.com/office/word/2012/wordml" xmlns:w16cei="http://schemas.microsoft.com/office/word/2026/wordml/cei" xmlns:w16cex="http://schemas.microsoft.com/office/word/2018/wordml/cex" xmlns:w16cid="http://schemas.microsoft.com/office/word/2016/wordml/cid" xmlns:w16="http://schemas.microsoft.com/office/word/2018/wordml" xmlns:w16du="http://schemas.microsoft.com/office/word/2023/wordml/word16du" xmlns:w16sdtdh="http://schemas.microsoft.com/office/word/2020/wordml/sdtdatahash" xmlns:w16sdtfl="http://schemas.microsoft.com/office/word/2024/wordml/sdtformatlock" xmlns:w16se="http://schemas.microsoft.com/office/word/2015/wordml/symex" xmlns:wpg="http://schemas.microsoft.com/office/word/2010/wordprocessingGroup" xmlns:wpi="http://schemas.microsoft.com/office/word/2010/wordprocessingInk" xmlns:wne="http://schemas.microsoft.com/office/word/2006/wordml" xmlns:wps="http://schemas.microsoft.com/office/word/2010/wordprocessingShape" mc:Ignorable="w14 w15 w16se w16cid w16 w16cex w16sdtdh w16sdtfl w16du wp14">
   <w:endnote w:type="separator" w:id="-1">
     <w:p>
       <w:pPr>
@@ -6980,7 +7261,7 @@
 </file>
 
 <file path=word/footer1.xml><?xml version="1.0" encoding="utf-8"?>
-<w:ftr xmlns:wpc="http://schemas.microsoft.com/office/word/2010/wordprocessingCanvas" xmlns:cx="http://schemas.microsoft.com/office/drawing/2014/chartex" xmlns:cx1="http://schemas.microsoft.com/office/drawing/2015/9/8/chartex" xmlns:cx2="http://schemas.microsoft.com/office/drawing/2015/10/21/chartex" xmlns:cx3="http://schemas.microsoft.com/office/drawing/2016/5/9/chartex" xmlns:cx4="http://schemas.microsoft.com/office/drawing/2016/5/10/chartex" xmlns:cx5="http://schemas.microsoft.com/office/drawing/2016/5/11/chartex" xmlns:cx6="http://schemas.microsoft.com/office/drawing/2016/5/12/chartex" xmlns:cx7="http://schemas.microsoft.com/office/drawing/2016/5/13/chartex" xmlns:cx8="http://schemas.microsoft.com/office/drawing/2016/5/14/chartex" xmlns:mc="http://schemas.openxmlformats.org/markup-compatibility/2006" xmlns:aink="http://schemas.microsoft.com/office/drawing/2016/ink" xmlns:am3d="http://schemas.microsoft.com/office/drawing/2017/model3d" xmlns:o="urn:schemas-microsoft-com:office:office" xmlns:oel="http://schemas.microsoft.com/office/2019/extlst" xmlns:r="http://schemas.openxmlformats.org/officeDocument/2006/relationships" xmlns:m="http://schemas.openxmlformats.org/officeDocument/2006/math" xmlns:v="urn:schemas-microsoft-com:vml" xmlns:wp14="http://schemas.microsoft.com/office/word/2010/wordprocessingDrawing" xmlns:wp="http://schemas.openxmlformats.org/drawingml/2006/wordprocessingDrawing" xmlns:w10="urn:schemas-microsoft-com:office:word" xmlns:w="http://schemas.openxmlformats.org/wordprocessingml/2006/main" xmlns:w14="http://schemas.microsoft.com/office/word/2010/wordml" xmlns:w15="http://schemas.microsoft.com/office/word/2012/wordml" xmlns:w16cex="http://schemas.microsoft.com/office/word/2018/wordml/cex" xmlns:w16cid="http://schemas.microsoft.com/office/word/2016/wordml/cid" xmlns:w16="http://schemas.microsoft.com/office/word/2018/wordml" xmlns:w16du="http://schemas.microsoft.com/office/word/2023/wordml/word16du" xmlns:w16sdtdh="http://schemas.microsoft.com/office/word/2020/wordml/sdtdatahash" xmlns:w16sdtfl="http://schemas.microsoft.com/office/word/2024/wordml/sdtformatlock" xmlns:w16se="http://schemas.microsoft.com/office/word/2015/wordml/symex" xmlns:wpg="http://schemas.microsoft.com/office/word/2010/wordprocessingGroup" xmlns:wpi="http://schemas.microsoft.com/office/word/2010/wordprocessingInk" xmlns:wne="http://schemas.microsoft.com/office/word/2006/wordml" xmlns:wps="http://schemas.microsoft.com/office/word/2010/wordprocessingShape" mc:Ignorable="w14 w15 w16se w16cid w16 w16cex w16sdtdh w16sdtfl w16du wp14">
+<w:ftr xmlns:wpc="http://schemas.microsoft.com/office/word/2010/wordprocessingCanvas" xmlns:cx="http://schemas.microsoft.com/office/drawing/2014/chartex" xmlns:cx1="http://schemas.microsoft.com/office/drawing/2015/9/8/chartex" xmlns:cx2="http://schemas.microsoft.com/office/drawing/2015/10/21/chartex" xmlns:cx3="http://schemas.microsoft.com/office/drawing/2016/5/9/chartex" xmlns:cx4="http://schemas.microsoft.com/office/drawing/2016/5/10/chartex" xmlns:cx5="http://schemas.microsoft.com/office/drawing/2016/5/11/chartex" xmlns:cx6="http://schemas.microsoft.com/office/drawing/2016/5/12/chartex" xmlns:cx7="http://schemas.microsoft.com/office/drawing/2016/5/13/chartex" xmlns:cx8="http://schemas.microsoft.com/office/drawing/2016/5/14/chartex" xmlns:mc="http://schemas.openxmlformats.org/markup-compatibility/2006" xmlns:aink="http://schemas.microsoft.com/office/drawing/2016/ink" xmlns:am3d="http://schemas.microsoft.com/office/drawing/2017/model3d" xmlns:o="urn:schemas-microsoft-com:office:office" xmlns:oel="http://schemas.microsoft.com/office/2019/extlst" xmlns:r="http://schemas.openxmlformats.org/officeDocument/2006/relationships" xmlns:m="http://schemas.openxmlformats.org/officeDocument/2006/math" xmlns:v="urn:schemas-microsoft-com:vml" xmlns:wp14="http://schemas.microsoft.com/office/word/2010/wordprocessingDrawing" xmlns:wp="http://schemas.openxmlformats.org/drawingml/2006/wordprocessingDrawing" xmlns:w10="urn:schemas-microsoft-com:office:word" xmlns:w="http://schemas.openxmlformats.org/wordprocessingml/2006/main" xmlns:w14="http://schemas.microsoft.com/office/word/2010/wordml" xmlns:w15="http://schemas.microsoft.com/office/word/2012/wordml" xmlns:w16cei="http://schemas.microsoft.com/office/word/2026/wordml/cei" xmlns:w16cex="http://schemas.microsoft.com/office/word/2018/wordml/cex" xmlns:w16cid="http://schemas.microsoft.com/office/word/2016/wordml/cid" xmlns:w16="http://schemas.microsoft.com/office/word/2018/wordml" xmlns:w16du="http://schemas.microsoft.com/office/word/2023/wordml/word16du" xmlns:w16sdtdh="http://schemas.microsoft.com/office/word/2020/wordml/sdtdatahash" xmlns:w16sdtfl="http://schemas.microsoft.com/office/word/2024/wordml/sdtformatlock" xmlns:w16se="http://schemas.microsoft.com/office/word/2015/wordml/symex" xmlns:wpg="http://schemas.microsoft.com/office/word/2010/wordprocessingGroup" xmlns:wpi="http://schemas.microsoft.com/office/word/2010/wordprocessingInk" xmlns:wne="http://schemas.microsoft.com/office/word/2006/wordml" xmlns:wps="http://schemas.microsoft.com/office/word/2010/wordprocessingShape" mc:Ignorable="w14 w15 w16se w16cid w16 w16cex w16sdtdh w16sdtfl w16du wp14">
   <w:p>
     <w:pPr>
       <w:pBdr>
@@ -7162,7 +7443,7 @@
 </file>
 
 <file path=word/footer2.xml><?xml version="1.0" encoding="utf-8"?>
-<w:ftr xmlns:wpc="http://schemas.microsoft.com/office/word/2010/wordprocessingCanvas" xmlns:cx="http://schemas.microsoft.com/office/drawing/2014/chartex" xmlns:cx1="http://schemas.microsoft.com/office/drawing/2015/9/8/chartex" xmlns:cx2="http://schemas.microsoft.com/office/drawing/2015/10/21/chartex" xmlns:cx3="http://schemas.microsoft.com/office/drawing/2016/5/9/chartex" xmlns:cx4="http://schemas.microsoft.com/office/drawing/2016/5/10/chartex" xmlns:cx5="http://schemas.microsoft.com/office/drawing/2016/5/11/chartex" xmlns:cx6="http://schemas.microsoft.com/office/drawing/2016/5/12/chartex" xmlns:cx7="http://schemas.microsoft.com/office/drawing/2016/5/13/chartex" xmlns:cx8="http://schemas.microsoft.com/office/drawing/2016/5/14/chartex" xmlns:mc="http://schemas.openxmlformats.org/markup-compatibility/2006" xmlns:aink="http://schemas.microsoft.com/office/drawing/2016/ink" xmlns:am3d="http://schemas.microsoft.com/office/drawing/2017/model3d" xmlns:o="urn:schemas-microsoft-com:office:office" xmlns:oel="http://schemas.microsoft.com/office/2019/extlst" xmlns:r="http://schemas.openxmlformats.org/officeDocument/2006/relationships" xmlns:m="http://schemas.openxmlformats.org/officeDocument/2006/math" xmlns:v="urn:schemas-microsoft-com:vml" xmlns:wp14="http://schemas.microsoft.com/office/word/2010/wordprocessingDrawing" xmlns:wp="http://schemas.openxmlformats.org/drawingml/2006/wordprocessingDrawing" xmlns:w10="urn:schemas-microsoft-com:office:word" xmlns:w="http://schemas.openxmlformats.org/wordprocessingml/2006/main" xmlns:w14="http://schemas.microsoft.com/office/word/2010/wordml" xmlns:w15="http://schemas.microsoft.com/office/word/2012/wordml" xmlns:w16cex="http://schemas.microsoft.com/office/word/2018/wordml/cex" xmlns:w16cid="http://schemas.microsoft.com/office/word/2016/wordml/cid" xmlns:w16="http://schemas.microsoft.com/office/word/2018/wordml" xmlns:w16du="http://schemas.microsoft.com/office/word/2023/wordml/word16du" xmlns:w16sdtdh="http://schemas.microsoft.com/office/word/2020/wordml/sdtdatahash" xmlns:w16sdtfl="http://schemas.microsoft.com/office/word/2024/wordml/sdtformatlock" xmlns:w16se="http://schemas.microsoft.com/office/word/2015/wordml/symex" xmlns:wpg="http://schemas.microsoft.com/office/word/2010/wordprocessingGroup" xmlns:wpi="http://schemas.microsoft.com/office/word/2010/wordprocessingInk" xmlns:wne="http://schemas.microsoft.com/office/word/2006/wordml" xmlns:wps="http://schemas.microsoft.com/office/word/2010/wordprocessingShape" mc:Ignorable="w14 w15 w16se w16cid w16 w16cex w16sdtdh w16sdtfl w16du wp14">
+<w:ftr xmlns:wpc="http://schemas.microsoft.com/office/word/2010/wordprocessingCanvas" xmlns:cx="http://schemas.microsoft.com/office/drawing/2014/chartex" xmlns:cx1="http://schemas.microsoft.com/office/drawing/2015/9/8/chartex" xmlns:cx2="http://schemas.microsoft.com/office/drawing/2015/10/21/chartex" xmlns:cx3="http://schemas.microsoft.com/office/drawing/2016/5/9/chartex" xmlns:cx4="http://schemas.microsoft.com/office/drawing/2016/5/10/chartex" xmlns:cx5="http://schemas.microsoft.com/office/drawing/2016/5/11/chartex" xmlns:cx6="http://schemas.microsoft.com/office/drawing/2016/5/12/chartex" xmlns:cx7="http://schemas.microsoft.com/office/drawing/2016/5/13/chartex" xmlns:cx8="http://schemas.microsoft.com/office/drawing/2016/5/14/chartex" xmlns:mc="http://schemas.openxmlformats.org/markup-compatibility/2006" xmlns:aink="http://schemas.microsoft.com/office/drawing/2016/ink" xmlns:am3d="http://schemas.microsoft.com/office/drawing/2017/model3d" xmlns:o="urn:schemas-microsoft-com:office:office" xmlns:oel="http://schemas.microsoft.com/office/2019/extlst" xmlns:r="http://schemas.openxmlformats.org/officeDocument/2006/relationships" xmlns:m="http://schemas.openxmlformats.org/officeDocument/2006/math" xmlns:v="urn:schemas-microsoft-com:vml" xmlns:wp14="http://schemas.microsoft.com/office/word/2010/wordprocessingDrawing" xmlns:wp="http://schemas.openxmlformats.org/drawingml/2006/wordprocessingDrawing" xmlns:w10="urn:schemas-microsoft-com:office:word" xmlns:w="http://schemas.openxmlformats.org/wordprocessingml/2006/main" xmlns:w14="http://schemas.microsoft.com/office/word/2010/wordml" xmlns:w15="http://schemas.microsoft.com/office/word/2012/wordml" xmlns:w16cei="http://schemas.microsoft.com/office/word/2026/wordml/cei" xmlns:w16cex="http://schemas.microsoft.com/office/word/2018/wordml/cex" xmlns:w16cid="http://schemas.microsoft.com/office/word/2016/wordml/cid" xmlns:w16="http://schemas.microsoft.com/office/word/2018/wordml" xmlns:w16du="http://schemas.microsoft.com/office/word/2023/wordml/word16du" xmlns:w16sdtdh="http://schemas.microsoft.com/office/word/2020/wordml/sdtdatahash" xmlns:w16sdtfl="http://schemas.microsoft.com/office/word/2024/wordml/sdtformatlock" xmlns:w16se="http://schemas.microsoft.com/office/word/2015/wordml/symex" xmlns:wpg="http://schemas.microsoft.com/office/word/2010/wordprocessingGroup" xmlns:wpi="http://schemas.microsoft.com/office/word/2010/wordprocessingInk" xmlns:wne="http://schemas.microsoft.com/office/word/2006/wordml" xmlns:wps="http://schemas.microsoft.com/office/word/2010/wordprocessingShape" mc:Ignorable="w14 w15 w16se w16cid w16 w16cex w16sdtdh w16sdtfl w16du wp14">
   <w:p>
     <w:pPr>
       <w:pBdr>
@@ -7365,7 +7646,7 @@
 </file>
 
 <file path=word/footnotes.xml><?xml version="1.0" encoding="utf-8"?>
-<w:footnotes xmlns:wpc="http://schemas.microsoft.com/office/word/2010/wordprocessingCanvas" xmlns:cx="http://schemas.microsoft.com/office/drawing/2014/chartex" xmlns:cx1="http://schemas.microsoft.com/office/drawing/2015/9/8/chartex" xmlns:cx2="http://schemas.microsoft.com/office/drawing/2015/10/21/chartex" xmlns:cx3="http://schemas.microsoft.com/office/drawing/2016/5/9/chartex" xmlns:cx4="http://schemas.microsoft.com/office/drawing/2016/5/10/chartex" xmlns:cx5="http://schemas.microsoft.com/office/drawing/2016/5/11/chartex" xmlns:cx6="http://schemas.microsoft.com/office/drawing/2016/5/12/chartex" xmlns:cx7="http://schemas.microsoft.com/office/drawing/2016/5/13/chartex" xmlns:cx8="http://schemas.microsoft.com/office/drawing/2016/5/14/chartex" xmlns:mc="http://schemas.openxmlformats.org/markup-compatibility/2006" xmlns:aink="http://schemas.microsoft.com/office/drawing/2016/ink" xmlns:am3d="http://schemas.microsoft.com/office/drawing/2017/model3d" xmlns:o="urn:schemas-microsoft-com:office:office" xmlns:oel="http://schemas.microsoft.com/office/2019/extlst" xmlns:r="http://schemas.openxmlformats.org/officeDocument/2006/relationships" xmlns:m="http://schemas.openxmlformats.org/officeDocument/2006/math" xmlns:v="urn:schemas-microsoft-com:vml" xmlns:wp14="http://schemas.microsoft.com/office/word/2010/wordprocessingDrawing" xmlns:wp="http://schemas.openxmlformats.org/drawingml/2006/wordprocessingDrawing" xmlns:w10="urn:schemas-microsoft-com:office:word" xmlns:w="http://schemas.openxmlformats.org/wordprocessingml/2006/main" xmlns:w14="http://schemas.microsoft.com/office/word/2010/wordml" xmlns:w15="http://schemas.microsoft.com/office/word/2012/wordml" xmlns:w16cex="http://schemas.microsoft.com/office/word/2018/wordml/cex" xmlns:w16cid="http://schemas.microsoft.com/office/word/2016/wordml/cid" xmlns:w16="http://schemas.microsoft.com/office/word/2018/wordml" xmlns:w16du="http://schemas.microsoft.com/office/word/2023/wordml/word16du" xmlns:w16sdtdh="http://schemas.microsoft.com/office/word/2020/wordml/sdtdatahash" xmlns:w16sdtfl="http://schemas.microsoft.com/office/word/2024/wordml/sdtformatlock" xmlns:w16se="http://schemas.microsoft.com/office/word/2015/wordml/symex" xmlns:wpg="http://schemas.microsoft.com/office/word/2010/wordprocessingGroup" xmlns:wpi="http://schemas.microsoft.com/office/word/2010/wordprocessingInk" xmlns:wne="http://schemas.microsoft.com/office/word/2006/wordml" xmlns:wps="http://schemas.microsoft.com/office/word/2010/wordprocessingShape" mc:Ignorable="w14 w15 w16se w16cid w16 w16cex w16sdtdh w16sdtfl w16du wp14">
+<w:footnotes xmlns:wpc="http://schemas.microsoft.com/office/word/2010/wordprocessingCanvas" xmlns:cx="http://schemas.microsoft.com/office/drawing/2014/chartex" xmlns:cx1="http://schemas.microsoft.com/office/drawing/2015/9/8/chartex" xmlns:cx2="http://schemas.microsoft.com/office/drawing/2015/10/21/chartex" xmlns:cx3="http://schemas.microsoft.com/office/drawing/2016/5/9/chartex" xmlns:cx4="http://schemas.microsoft.com/office/drawing/2016/5/10/chartex" xmlns:cx5="http://schemas.microsoft.com/office/drawing/2016/5/11/chartex" xmlns:cx6="http://schemas.microsoft.com/office/drawing/2016/5/12/chartex" xmlns:cx7="http://schemas.microsoft.com/office/drawing/2016/5/13/chartex" xmlns:cx8="http://schemas.microsoft.com/office/drawing/2016/5/14/chartex" xmlns:mc="http://schemas.openxmlformats.org/markup-compatibility/2006" xmlns:aink="http://schemas.microsoft.com/office/drawing/2016/ink" xmlns:am3d="http://schemas.microsoft.com/office/drawing/2017/model3d" xmlns:o="urn:schemas-microsoft-com:office:office" xmlns:oel="http://schemas.microsoft.com/office/2019/extlst" xmlns:r="http://schemas.openxmlformats.org/officeDocument/2006/relationships" xmlns:m="http://schemas.openxmlformats.org/officeDocument/2006/math" xmlns:v="urn:schemas-microsoft-com:vml" xmlns:wp14="http://schemas.microsoft.com/office/word/2010/wordprocessingDrawing" xmlns:wp="http://schemas.openxmlformats.org/drawingml/2006/wordprocessingDrawing" xmlns:w10="urn:schemas-microsoft-com:office:word" xmlns:w="http://schemas.openxmlformats.org/wordprocessingml/2006/main" xmlns:w14="http://schemas.microsoft.com/office/word/2010/wordml" xmlns:w15="http://schemas.microsoft.com/office/word/2012/wordml" xmlns:w16cei="http://schemas.microsoft.com/office/word/2026/wordml/cei" xmlns:w16cex="http://schemas.microsoft.com/office/word/2018/wordml/cex" xmlns:w16cid="http://schemas.microsoft.com/office/word/2016/wordml/cid" xmlns:w16="http://schemas.microsoft.com/office/word/2018/wordml" xmlns:w16du="http://schemas.microsoft.com/office/word/2023/wordml/word16du" xmlns:w16sdtdh="http://schemas.microsoft.com/office/word/2020/wordml/sdtdatahash" xmlns:w16sdtfl="http://schemas.microsoft.com/office/word/2024/wordml/sdtformatlock" xmlns:w16se="http://schemas.microsoft.com/office/word/2015/wordml/symex" xmlns:wpg="http://schemas.microsoft.com/office/word/2010/wordprocessingGroup" xmlns:wpi="http://schemas.microsoft.com/office/word/2010/wordprocessingInk" xmlns:wne="http://schemas.microsoft.com/office/word/2006/wordml" xmlns:wps="http://schemas.microsoft.com/office/word/2010/wordprocessingShape" mc:Ignorable="w14 w15 w16se w16cid w16 w16cex w16sdtdh w16sdtfl w16du wp14">
   <w:footnote w:type="separator" w:id="-1">
     <w:p>
       <w:pPr>
@@ -7390,7 +7671,7 @@
 </file>
 
 <file path=word/header1.xml><?xml version="1.0" encoding="utf-8"?>
-<w:hdr xmlns:wpc="http://schemas.microsoft.com/office/word/2010/wordprocessingCanvas" xmlns:cx="http://schemas.microsoft.com/office/drawing/2014/chartex" xmlns:cx1="http://schemas.microsoft.com/office/drawing/2015/9/8/chartex" xmlns:cx2="http://schemas.microsoft.com/office/drawing/2015/10/21/chartex" xmlns:cx3="http://schemas.microsoft.com/office/drawing/2016/5/9/chartex" xmlns:cx4="http://schemas.microsoft.com/office/drawing/2016/5/10/chartex" xmlns:cx5="http://schemas.microsoft.com/office/drawing/2016/5/11/chartex" xmlns:cx6="http://schemas.microsoft.com/office/drawing/2016/5/12/chartex" xmlns:cx7="http://schemas.microsoft.com/office/drawing/2016/5/13/chartex" xmlns:cx8="http://schemas.microsoft.com/office/drawing/2016/5/14/chartex" xmlns:mc="http://schemas.openxmlformats.org/markup-compatibility/2006" xmlns:aink="http://schemas.microsoft.com/office/drawing/2016/ink" xmlns:am3d="http://schemas.microsoft.com/office/drawing/2017/model3d" xmlns:o="urn:schemas-microsoft-com:office:office" xmlns:oel="http://schemas.microsoft.com/office/2019/extlst" xmlns:r="http://schemas.openxmlformats.org/officeDocument/2006/relationships" xmlns:m="http://schemas.openxmlformats.org/officeDocument/2006/math" xmlns:v="urn:schemas-microsoft-com:vml" xmlns:wp14="http://schemas.microsoft.com/office/word/2010/wordprocessingDrawing" xmlns:wp="http://schemas.openxmlformats.org/drawingml/2006/wordprocessingDrawing" xmlns:w10="urn:schemas-microsoft-com:office:word" xmlns:w="http://schemas.openxmlformats.org/wordprocessingml/2006/main" xmlns:w14="http://schemas.microsoft.com/office/word/2010/wordml" xmlns:w15="http://schemas.microsoft.com/office/word/2012/wordml" xmlns:w16cex="http://schemas.microsoft.com/office/word/2018/wordml/cex" xmlns:w16cid="http://schemas.microsoft.com/office/word/2016/wordml/cid" xmlns:w16="http://schemas.microsoft.com/office/word/2018/wordml" xmlns:w16du="http://schemas.microsoft.com/office/word/2023/wordml/word16du" xmlns:w16sdtdh="http://schemas.microsoft.com/office/word/2020/wordml/sdtdatahash" xmlns:w16sdtfl="http://schemas.microsoft.com/office/word/2024/wordml/sdtformatlock" xmlns:w16se="http://schemas.microsoft.com/office/word/2015/wordml/symex" xmlns:wpg="http://schemas.microsoft.com/office/word/2010/wordprocessingGroup" xmlns:wpi="http://schemas.microsoft.com/office/word/2010/wordprocessingInk" xmlns:wne="http://schemas.microsoft.com/office/word/2006/wordml" xmlns:wps="http://schemas.microsoft.com/office/word/2010/wordprocessingShape" mc:Ignorable="w14 w15 w16se w16cid w16 w16cex w16sdtdh w16sdtfl w16du wp14">
+<w:hdr xmlns:wpc="http://schemas.microsoft.com/office/word/2010/wordprocessingCanvas" xmlns:cx="http://schemas.microsoft.com/office/drawing/2014/chartex" xmlns:cx1="http://schemas.microsoft.com/office/drawing/2015/9/8/chartex" xmlns:cx2="http://schemas.microsoft.com/office/drawing/2015/10/21/chartex" xmlns:cx3="http://schemas.microsoft.com/office/drawing/2016/5/9/chartex" xmlns:cx4="http://schemas.microsoft.com/office/drawing/2016/5/10/chartex" xmlns:cx5="http://schemas.microsoft.com/office/drawing/2016/5/11/chartex" xmlns:cx6="http://schemas.microsoft.com/office/drawing/2016/5/12/chartex" xmlns:cx7="http://schemas.microsoft.com/office/drawing/2016/5/13/chartex" xmlns:cx8="http://schemas.microsoft.com/office/drawing/2016/5/14/chartex" xmlns:mc="http://schemas.openxmlformats.org/markup-compatibility/2006" xmlns:aink="http://schemas.microsoft.com/office/drawing/2016/ink" xmlns:am3d="http://schemas.microsoft.com/office/drawing/2017/model3d" xmlns:o="urn:schemas-microsoft-com:office:office" xmlns:oel="http://schemas.microsoft.com/office/2019/extlst" xmlns:r="http://schemas.openxmlformats.org/officeDocument/2006/relationships" xmlns:m="http://schemas.openxmlformats.org/officeDocument/2006/math" xmlns:v="urn:schemas-microsoft-com:vml" xmlns:wp14="http://schemas.microsoft.com/office/word/2010/wordprocessingDrawing" xmlns:wp="http://schemas.openxmlformats.org/drawingml/2006/wordprocessingDrawing" xmlns:w10="urn:schemas-microsoft-com:office:word" xmlns:w="http://schemas.openxmlformats.org/wordprocessingml/2006/main" xmlns:w14="http://schemas.microsoft.com/office/word/2010/wordml" xmlns:w15="http://schemas.microsoft.com/office/word/2012/wordml" xmlns:w16cei="http://schemas.microsoft.com/office/word/2026/wordml/cei" xmlns:w16cex="http://schemas.microsoft.com/office/word/2018/wordml/cex" xmlns:w16cid="http://schemas.microsoft.com/office/word/2016/wordml/cid" xmlns:w16="http://schemas.microsoft.com/office/word/2018/wordml" xmlns:w16du="http://schemas.microsoft.com/office/word/2023/wordml/word16du" xmlns:w16sdtdh="http://schemas.microsoft.com/office/word/2020/wordml/sdtdatahash" xmlns:w16sdtfl="http://schemas.microsoft.com/office/word/2024/wordml/sdtformatlock" xmlns:w16se="http://schemas.microsoft.com/office/word/2015/wordml/symex" xmlns:wpg="http://schemas.microsoft.com/office/word/2010/wordprocessingGroup" xmlns:wpi="http://schemas.microsoft.com/office/word/2010/wordprocessingInk" xmlns:wne="http://schemas.microsoft.com/office/word/2006/wordml" xmlns:wps="http://schemas.microsoft.com/office/word/2010/wordprocessingShape" mc:Ignorable="w14 w15 w16se w16cid w16 w16cex w16sdtdh w16sdtfl w16du wp14">
   <w:p>
     <w:pPr>
       <w:pStyle w:val="Header"/>
@@ -7403,7 +7684,7 @@
 </file>
 
 <file path=word/header2.xml><?xml version="1.0" encoding="utf-8"?>
-<w:hdr xmlns:wpc="http://schemas.microsoft.com/office/word/2010/wordprocessingCanvas" xmlns:cx="http://schemas.microsoft.com/office/drawing/2014/chartex" xmlns:cx1="http://schemas.microsoft.com/office/drawing/2015/9/8/chartex" xmlns:cx2="http://schemas.microsoft.com/office/drawing/2015/10/21/chartex" xmlns:cx3="http://schemas.microsoft.com/office/drawing/2016/5/9/chartex" xmlns:cx4="http://schemas.microsoft.com/office/drawing/2016/5/10/chartex" xmlns:cx5="http://schemas.microsoft.com/office/drawing/2016/5/11/chartex" xmlns:cx6="http://schemas.microsoft.com/office/drawing/2016/5/12/chartex" xmlns:cx7="http://schemas.microsoft.com/office/drawing/2016/5/13/chartex" xmlns:cx8="http://schemas.microsoft.com/office/drawing/2016/5/14/chartex" xmlns:mc="http://schemas.openxmlformats.org/markup-compatibility/2006" xmlns:aink="http://schemas.microsoft.com/office/drawing/2016/ink" xmlns:am3d="http://schemas.microsoft.com/office/drawing/2017/model3d" xmlns:o="urn:schemas-microsoft-com:office:office" xmlns:oel="http://schemas.microsoft.com/office/2019/extlst" xmlns:r="http://schemas.openxmlformats.org/officeDocument/2006/relationships" xmlns:m="http://schemas.openxmlformats.org/officeDocument/2006/math" xmlns:v="urn:schemas-microsoft-com:vml" xmlns:wp14="http://schemas.microsoft.com/office/word/2010/wordprocessingDrawing" xmlns:wp="http://schemas.openxmlformats.org/drawingml/2006/wordprocessingDrawing" xmlns:w10="urn:schemas-microsoft-com:office:word" xmlns:w="http://schemas.openxmlformats.org/wordprocessingml/2006/main" xmlns:w14="http://schemas.microsoft.com/office/word/2010/wordml" xmlns:w15="http://schemas.microsoft.com/office/word/2012/wordml" xmlns:w16cex="http://schemas.microsoft.com/office/word/2018/wordml/cex" xmlns:w16cid="http://schemas.microsoft.com/office/word/2016/wordml/cid" xmlns:w16="http://schemas.microsoft.com/office/word/2018/wordml" xmlns:w16du="http://schemas.microsoft.com/office/word/2023/wordml/word16du" xmlns:w16sdtdh="http://schemas.microsoft.com/office/word/2020/wordml/sdtdatahash" xmlns:w16sdtfl="http://schemas.microsoft.com/office/word/2024/wordml/sdtformatlock" xmlns:w16se="http://schemas.microsoft.com/office/word/2015/wordml/symex" xmlns:wpg="http://schemas.microsoft.com/office/word/2010/wordprocessingGroup" xmlns:wpi="http://schemas.microsoft.com/office/word/2010/wordprocessingInk" xmlns:wne="http://schemas.microsoft.com/office/word/2006/wordml" xmlns:wps="http://schemas.microsoft.com/office/word/2010/wordprocessingShape" mc:Ignorable="w14 w15 w16se w16cid w16 w16cex w16sdtdh w16sdtfl w16du wp14">
+<w:hdr xmlns:wpc="http://schemas.microsoft.com/office/word/2010/wordprocessingCanvas" xmlns:cx="http://schemas.microsoft.com/office/drawing/2014/chartex" xmlns:cx1="http://schemas.microsoft.com/office/drawing/2015/9/8/chartex" xmlns:cx2="http://schemas.microsoft.com/office/drawing/2015/10/21/chartex" xmlns:cx3="http://schemas.microsoft.com/office/drawing/2016/5/9/chartex" xmlns:cx4="http://schemas.microsoft.com/office/drawing/2016/5/10/chartex" xmlns:cx5="http://schemas.microsoft.com/office/drawing/2016/5/11/chartex" xmlns:cx6="http://schemas.microsoft.com/office/drawing/2016/5/12/chartex" xmlns:cx7="http://schemas.microsoft.com/office/drawing/2016/5/13/chartex" xmlns:cx8="http://schemas.microsoft.com/office/drawing/2016/5/14/chartex" xmlns:mc="http://schemas.openxmlformats.org/markup-compatibility/2006" xmlns:aink="http://schemas.microsoft.com/office/drawing/2016/ink" xmlns:am3d="http://schemas.microsoft.com/office/drawing/2017/model3d" xmlns:o="urn:schemas-microsoft-com:office:office" xmlns:oel="http://schemas.microsoft.com/office/2019/extlst" xmlns:r="http://schemas.openxmlformats.org/officeDocument/2006/relationships" xmlns:m="http://schemas.openxmlformats.org/officeDocument/2006/math" xmlns:v="urn:schemas-microsoft-com:vml" xmlns:wp14="http://schemas.microsoft.com/office/word/2010/wordprocessingDrawing" xmlns:wp="http://schemas.openxmlformats.org/drawingml/2006/wordprocessingDrawing" xmlns:w10="urn:schemas-microsoft-com:office:word" xmlns:w="http://schemas.openxmlformats.org/wordprocessingml/2006/main" xmlns:w14="http://schemas.microsoft.com/office/word/2010/wordml" xmlns:w15="http://schemas.microsoft.com/office/word/2012/wordml" xmlns:w16cei="http://schemas.microsoft.com/office/word/2026/wordml/cei" xmlns:w16cex="http://schemas.microsoft.com/office/word/2018/wordml/cex" xmlns:w16cid="http://schemas.microsoft.com/office/word/2016/wordml/cid" xmlns:w16="http://schemas.microsoft.com/office/word/2018/wordml" xmlns:w16du="http://schemas.microsoft.com/office/word/2023/wordml/word16du" xmlns:w16sdtdh="http://schemas.microsoft.com/office/word/2020/wordml/sdtdatahash" xmlns:w16sdtfl="http://schemas.microsoft.com/office/word/2024/wordml/sdtformatlock" xmlns:w16se="http://schemas.microsoft.com/office/word/2015/wordml/symex" xmlns:wpg="http://schemas.microsoft.com/office/word/2010/wordprocessingGroup" xmlns:wpi="http://schemas.microsoft.com/office/word/2010/wordprocessingInk" xmlns:wne="http://schemas.microsoft.com/office/word/2006/wordml" xmlns:wps="http://schemas.microsoft.com/office/word/2010/wordprocessingShape" mc:Ignorable="w14 w15 w16se w16cid w16 w16cex w16sdtdh w16sdtfl w16du wp14">
   <w:p>
     <w:pPr>
       <w:pStyle w:val="Header"/>

</xml_diff>